<commit_message>
Expand co-author signatures and checkbox data
Add logic to clone co-author signature blocks for document 9 (expandCoauthorSignatures) using coauthor_count and coauthor_name_i placeholders, replace corres_name per co-author, and insert generated blocks into the DOCX XML. Add a cleanup pass to remove any leftover {{...}} placeholders. In the preview JS, capture checkbox values into the form data (checked → value or '☑', unchecked → '☐'). Update admin/applicant doc_form_9 templates to widen the name field column and remove the separate role input (adjusted layout). Also add/update the docx template and uploaded p2doc_9.docx binary files.
</commit_message>
<xml_diff>
--- a/HRCP-KKU-Academic/uploads/academic/position/1/p2doc_9.docx
+++ b/HRCP-KKU-Academic/uploads/academic/position/1/p2doc_9.docx
@@ -1516,7 +1516,7 @@
         <w:spacing w:after="0" w:line="276" w:lineRule="auto"/>
         <w:ind w:left="720" w:firstLine="720"/>
         <w:rPr>
-          <w:rFonts w:ascii="TH Sarabun New" w:hAnsi="TH Sarabun New" w:cs="TH Sarabun New"/>
+          <w:rFonts w:ascii="TH Sarabun New" w:hAnsi="TH Sarabun New" w:cs="TH Sarabun New" w:hint="cs"/>
           <w:sz w:val="32"/>
           <w:szCs w:val="32"/>
         </w:rPr>
@@ -1567,6 +1567,16 @@
           <w:cs/>
         </w:rPr>
         <w:t>หนังสือ</w:t>
+      </w:r>
+      <w:r>
+        <w:rPr>
+          <w:rFonts w:ascii="Arial" w:hAnsi="Arial" w:cs="Arial"/>
+          <w:color w:val="E2E5E9"/>
+          <w:sz w:val="21"/>
+          <w:szCs w:val="21"/>
+          <w:shd w:val="clear" w:color="auto" w:fill="303030"/>
+        </w:rPr>
+        <w:t xml:space="preserve"> </w:t>
       </w:r>
     </w:p>
     <w:p>
@@ -4845,7 +4855,6 @@
   <w:style w:type="character" w:default="1" w:styleId="DefaultParagraphFont">
     <w:name w:val="Default Paragraph Font"/>
     <w:uiPriority w:val="1"/>
-    <w:semiHidden/>
     <w:unhideWhenUsed/>
   </w:style>
   <w:style w:type="table" w:default="1" w:styleId="TableNormal">

</xml_diff>